<commit_message>
Phương án iPhone: chỉ gồm điện thoại và chân dựng
Co-Authored-By: Claude Opus 5.5 <noreply@anthropic.com>
Claude-Session: https://claude.ai/code/session_01YRCwS4DykMA9Tk52eVN1Wm
</commit_message>
<xml_diff>
--- a/Phieu_de_xuat_iPhone14Pro_livestream.docx
+++ b/Phieu_de_xuat_iPhone14Pro_livestream.docx
@@ -945,13 +945,13 @@
         <w:rPr>
           <w:i w:val="0"/>
         </w:rPr>
-        <w:t xml:space="preserve">Đề xuất mua sắm bổ sung 01 điện thoại iPhone 14 Pro (máy cũ) kèm phụ kiện để live Shopee song song với TikTok trong khung giờ sáng – chiều (8h–16h), hiện khung này mới chỉ live TikTok. Tổng chi phí thiết bị dự kiến: </w:t>
-      </w:r>
-      <w:r>
-        <w:rPr>
-          <w:b/>
-        </w:rPr>
-        <w:t>18.089.400 đ.</w:t>
+        <w:t xml:space="preserve">Đề xuất mua sắm bổ sung 01 điện thoại iPhone 14 Pro (máy cũ) và 01 chân dựng để live Shopee song song với TikTok trong khung giờ sáng – chiều (8h–16h), hiện khung này mới chỉ live TikTok. Tổng chi phí thiết bị dự kiến: </w:t>
+      </w:r>
+      <w:r>
+        <w:rPr>
+          <w:b/>
+        </w:rPr>
+        <w:t>11.815.400 đ.</w:t>
       </w:r>
     </w:p>
     <w:tbl>
@@ -1190,7 +1190,7 @@
               <w:rPr>
                 <w:sz w:val="22"/>
               </w:rPr>
-              <w:t>Micro shotgun Boya BM6060</w:t>
+              <w:t>Chân dựng (chân máy cao 1m72)</w:t>
             </w:r>
           </w:p>
         </w:tc>
@@ -1225,7 +1225,7 @@
               <w:rPr>
                 <w:sz w:val="22"/>
               </w:rPr>
-              <w:t>1.566.000</w:t>
+              <w:t>815.400</w:t>
             </w:r>
           </w:p>
         </w:tc>
@@ -1243,7 +1243,7 @@
               <w:rPr>
                 <w:sz w:val="22"/>
               </w:rPr>
-              <w:t>1.566.000</w:t>
+              <w:t>815.400</w:t>
             </w:r>
           </w:p>
         </w:tc>
@@ -1260,9 +1260,9 @@
             <w:r/>
             <w:r>
               <w:rPr>
-                <w:sz w:val="22"/>
-              </w:rPr>
-              <w:t>3</w:t>
+                <w:b/>
+                <w:sz w:val="22"/>
+              </w:rPr>
             </w:r>
           </w:p>
         </w:tc>
@@ -1277,9 +1277,10 @@
             <w:r/>
             <w:r>
               <w:rPr>
-                <w:sz w:val="22"/>
-              </w:rPr>
-              <w:t>Chân máy ảnh cao 1m72</w:t>
+                <w:b/>
+                <w:sz w:val="22"/>
+              </w:rPr>
+              <w:t>TỔNG CỘNG</w:t>
             </w:r>
           </w:p>
         </w:tc>
@@ -1294,9 +1295,9 @@
             <w:r/>
             <w:r>
               <w:rPr>
-                <w:sz w:val="22"/>
-              </w:rPr>
-              <w:t>1</w:t>
+                <w:b/>
+                <w:sz w:val="22"/>
+              </w:rPr>
             </w:r>
           </w:p>
         </w:tc>
@@ -1312,9 +1313,9 @@
             <w:r/>
             <w:r>
               <w:rPr>
-                <w:sz w:val="22"/>
-              </w:rPr>
-              <w:t>815.400</w:t>
+                <w:b/>
+                <w:sz w:val="22"/>
+              </w:rPr>
             </w:r>
           </w:p>
         </w:tc>
@@ -1330,367 +1331,10 @@
             <w:r/>
             <w:r>
               <w:rPr>
-                <w:sz w:val="22"/>
-              </w:rPr>
-              <w:t>815.400</w:t>
-            </w:r>
-          </w:p>
-        </w:tc>
-      </w:tr>
-      <w:tr>
-        <w:tc>
-          <w:tcPr>
-            <w:tcW w:type="dxa" w:w="624"/>
-          </w:tcPr>
-          <w:p>
-            <w:pPr>
-              <w:spacing w:after="20" w:before="20"/>
-            </w:pPr>
-            <w:r/>
-            <w:r>
-              <w:rPr>
-                <w:sz w:val="22"/>
-              </w:rPr>
-              <w:t>4</w:t>
-            </w:r>
-          </w:p>
-        </w:tc>
-        <w:tc>
-          <w:tcPr>
-            <w:tcW w:type="dxa" w:w="4309"/>
-          </w:tcPr>
-          <w:p>
-            <w:pPr>
-              <w:spacing w:after="20" w:before="20"/>
-            </w:pPr>
-            <w:r/>
-            <w:r>
-              <w:rPr>
-                <w:sz w:val="22"/>
-              </w:rPr>
-              <w:t>Chân nhỏ gắn micro để bàn</w:t>
-            </w:r>
-          </w:p>
-        </w:tc>
-        <w:tc>
-          <w:tcPr>
-            <w:tcW w:type="dxa" w:w="624"/>
-          </w:tcPr>
-          <w:p>
-            <w:pPr>
-              <w:spacing w:after="20" w:before="20"/>
-            </w:pPr>
-            <w:r/>
-            <w:r>
-              <w:rPr>
-                <w:sz w:val="22"/>
-              </w:rPr>
-              <w:t>1</w:t>
-            </w:r>
-          </w:p>
-        </w:tc>
-        <w:tc>
-          <w:tcPr>
-            <w:tcW w:type="dxa" w:w="1587"/>
-          </w:tcPr>
-          <w:p>
-            <w:pPr>
-              <w:spacing w:after="20" w:before="20"/>
-              <w:jc w:val="right"/>
-            </w:pPr>
-            <w:r/>
-            <w:r>
-              <w:rPr>
-                <w:sz w:val="22"/>
-              </w:rPr>
-              <w:t>108.000</w:t>
-            </w:r>
-          </w:p>
-        </w:tc>
-        <w:tc>
-          <w:tcPr>
-            <w:tcW w:type="dxa" w:w="1701"/>
-          </w:tcPr>
-          <w:p>
-            <w:pPr>
-              <w:spacing w:after="20" w:before="20"/>
-              <w:jc w:val="right"/>
-            </w:pPr>
-            <w:r/>
-            <w:r>
-              <w:rPr>
-                <w:sz w:val="22"/>
-              </w:rPr>
-              <w:t>108.000</w:t>
-            </w:r>
-          </w:p>
-        </w:tc>
-      </w:tr>
-      <w:tr>
-        <w:tc>
-          <w:tcPr>
-            <w:tcW w:type="dxa" w:w="624"/>
-          </w:tcPr>
-          <w:p>
-            <w:pPr>
-              <w:spacing w:after="20" w:before="20"/>
-            </w:pPr>
-            <w:r/>
-            <w:r>
-              <w:rPr>
-                <w:sz w:val="22"/>
-              </w:rPr>
-              <w:t>5</w:t>
-            </w:r>
-          </w:p>
-        </w:tc>
-        <w:tc>
-          <w:tcPr>
-            <w:tcW w:type="dxa" w:w="4309"/>
-          </w:tcPr>
-          <w:p>
-            <w:pPr>
-              <w:spacing w:after="20" w:before="20"/>
-            </w:pPr>
-            <w:r/>
-            <w:r>
-              <w:rPr>
-                <w:sz w:val="22"/>
-              </w:rPr>
-              <w:t>Màn hình TV Coocaa 43 inch</w:t>
-            </w:r>
-          </w:p>
-        </w:tc>
-        <w:tc>
-          <w:tcPr>
-            <w:tcW w:type="dxa" w:w="624"/>
-          </w:tcPr>
-          <w:p>
-            <w:pPr>
-              <w:spacing w:after="20" w:before="20"/>
-            </w:pPr>
-            <w:r/>
-            <w:r>
-              <w:rPr>
-                <w:sz w:val="22"/>
-              </w:rPr>
-              <w:t>1</w:t>
-            </w:r>
-          </w:p>
-        </w:tc>
-        <w:tc>
-          <w:tcPr>
-            <w:tcW w:type="dxa" w:w="1587"/>
-          </w:tcPr>
-          <w:p>
-            <w:pPr>
-              <w:spacing w:after="20" w:before="20"/>
-              <w:jc w:val="right"/>
-            </w:pPr>
-            <w:r/>
-            <w:r>
-              <w:rPr>
-                <w:sz w:val="22"/>
-              </w:rPr>
-              <w:t>4.200.000</w:t>
-            </w:r>
-          </w:p>
-        </w:tc>
-        <w:tc>
-          <w:tcPr>
-            <w:tcW w:type="dxa" w:w="1701"/>
-          </w:tcPr>
-          <w:p>
-            <w:pPr>
-              <w:spacing w:after="20" w:before="20"/>
-              <w:jc w:val="right"/>
-            </w:pPr>
-            <w:r/>
-            <w:r>
-              <w:rPr>
-                <w:sz w:val="22"/>
-              </w:rPr>
-              <w:t>4.200.000</w:t>
-            </w:r>
-          </w:p>
-        </w:tc>
-      </w:tr>
-      <w:tr>
-        <w:tc>
-          <w:tcPr>
-            <w:tcW w:type="dxa" w:w="624"/>
-          </w:tcPr>
-          <w:p>
-            <w:pPr>
-              <w:spacing w:after="20" w:before="20"/>
-            </w:pPr>
-            <w:r/>
-            <w:r>
-              <w:rPr>
-                <w:sz w:val="22"/>
-              </w:rPr>
-              <w:t>6</w:t>
-            </w:r>
-          </w:p>
-        </w:tc>
-        <w:tc>
-          <w:tcPr>
-            <w:tcW w:type="dxa" w:w="4309"/>
-          </w:tcPr>
-          <w:p>
-            <w:pPr>
-              <w:spacing w:after="20" w:before="20"/>
-            </w:pPr>
-            <w:r/>
-            <w:r>
-              <w:rPr>
-                <w:sz w:val="22"/>
-              </w:rPr>
-              <w:t>Dây HDMI dài 5m</w:t>
-            </w:r>
-          </w:p>
-        </w:tc>
-        <w:tc>
-          <w:tcPr>
-            <w:tcW w:type="dxa" w:w="624"/>
-          </w:tcPr>
-          <w:p>
-            <w:pPr>
-              <w:spacing w:after="20" w:before="20"/>
-            </w:pPr>
-            <w:r/>
-            <w:r>
-              <w:rPr>
-                <w:sz w:val="22"/>
-              </w:rPr>
-              <w:t>1</w:t>
-            </w:r>
-          </w:p>
-        </w:tc>
-        <w:tc>
-          <w:tcPr>
-            <w:tcW w:type="dxa" w:w="1587"/>
-          </w:tcPr>
-          <w:p>
-            <w:pPr>
-              <w:spacing w:after="20" w:before="20"/>
-              <w:jc w:val="right"/>
-            </w:pPr>
-            <w:r/>
-            <w:r>
-              <w:rPr>
-                <w:sz w:val="22"/>
-              </w:rPr>
-              <w:t>400.000</w:t>
-            </w:r>
-          </w:p>
-        </w:tc>
-        <w:tc>
-          <w:tcPr>
-            <w:tcW w:type="dxa" w:w="1701"/>
-          </w:tcPr>
-          <w:p>
-            <w:pPr>
-              <w:spacing w:after="20" w:before="20"/>
-              <w:jc w:val="right"/>
-            </w:pPr>
-            <w:r/>
-            <w:r>
-              <w:rPr>
-                <w:sz w:val="22"/>
-              </w:rPr>
-              <w:t>400.000</w:t>
-            </w:r>
-          </w:p>
-        </w:tc>
-      </w:tr>
-      <w:tr>
-        <w:tc>
-          <w:tcPr>
-            <w:tcW w:type="dxa" w:w="624"/>
-          </w:tcPr>
-          <w:p>
-            <w:pPr>
-              <w:spacing w:after="20" w:before="20"/>
-            </w:pPr>
-            <w:r/>
-            <w:r>
-              <w:rPr>
-                <w:b/>
-                <w:sz w:val="22"/>
-              </w:rPr>
-            </w:r>
-          </w:p>
-        </w:tc>
-        <w:tc>
-          <w:tcPr>
-            <w:tcW w:type="dxa" w:w="4309"/>
-          </w:tcPr>
-          <w:p>
-            <w:pPr>
-              <w:spacing w:after="20" w:before="20"/>
-            </w:pPr>
-            <w:r/>
-            <w:r>
-              <w:rPr>
-                <w:b/>
-                <w:sz w:val="22"/>
-              </w:rPr>
-              <w:t>TỔNG CỘNG</w:t>
-            </w:r>
-          </w:p>
-        </w:tc>
-        <w:tc>
-          <w:tcPr>
-            <w:tcW w:type="dxa" w:w="624"/>
-          </w:tcPr>
-          <w:p>
-            <w:pPr>
-              <w:spacing w:after="20" w:before="20"/>
-            </w:pPr>
-            <w:r/>
-            <w:r>
-              <w:rPr>
-                <w:b/>
-                <w:sz w:val="22"/>
-              </w:rPr>
-            </w:r>
-          </w:p>
-        </w:tc>
-        <w:tc>
-          <w:tcPr>
-            <w:tcW w:type="dxa" w:w="1587"/>
-          </w:tcPr>
-          <w:p>
-            <w:pPr>
-              <w:spacing w:after="20" w:before="20"/>
-              <w:jc w:val="right"/>
-            </w:pPr>
-            <w:r/>
-            <w:r>
-              <w:rPr>
-                <w:b/>
-                <w:sz w:val="22"/>
-              </w:rPr>
-            </w:r>
-          </w:p>
-        </w:tc>
-        <w:tc>
-          <w:tcPr>
-            <w:tcW w:type="dxa" w:w="1701"/>
-          </w:tcPr>
-          <w:p>
-            <w:pPr>
-              <w:spacing w:after="20" w:before="20"/>
-              <w:jc w:val="right"/>
-            </w:pPr>
-            <w:r/>
-            <w:r>
-              <w:rPr>
-                <w:b/>
-                <w:sz w:val="22"/>
-              </w:rPr>
-              <w:t>18.089.400</w:t>
+                <w:b/>
+                <w:sz w:val="22"/>
+              </w:rPr>
+              <w:t>11.815.400</w:t>
             </w:r>
           </w:p>
         </w:tc>
@@ -1716,7 +1360,7 @@
         <w:rPr>
           <w:i/>
         </w:rPr>
-        <w:t>Giá iPhone 14 Pro cũ là giá tham khảo thị trường (~11 triệu đồng); các thiết bị còn lại theo bảng "Mô hình chi phí phòng livestream" – sheet Thiết bị. Phương án này rẻ hơn phương án camera Hollyland 2.490.000 đ; điện thoại live trực tiếp bằng app Shopee, cần cắm sạc liên tục trong ca live.</w:t>
+        <w:t>Giá iPhone 14 Pro cũ là giá tham khảo thị trường (~11 triệu đồng); giá chân dựng theo bảng "Mô hình chi phí phòng livestream" – sheet Thiết bị. Điện thoại live trực tiếp bằng app Shopee, không cần thêm micro, màn hình hay phụ kiện khác; chỉ cần cắm sạc trong ca live. Phương án này rẻ hơn phương án camera Hollyland 8.764.000 đ.</w:t>
       </w:r>
     </w:p>
     <w:p>
@@ -1728,7 +1372,7 @@
         <w:rPr>
           <w:i w:val="0"/>
         </w:rPr>
-        <w:t>Thời gian triển khai: từ tháng 10/2026. Chi phí khấu hao 24 tháng ≈ 753.725 đ/tháng.</w:t>
+        <w:t>Thời gian triển khai: từ tháng 10/2026. Chi phí khấu hao 24 tháng ≈ 492.308 đ/tháng.</w:t>
       </w:r>
     </w:p>
     <w:p>
@@ -2458,7 +2102,7 @@
         <w:rPr>
           <w:i w:val="0"/>
         </w:rPr>
-        <w:t>gắn thêm 01 iPhone 14 Pro (máy cũ) để live Shopee song song với TikTok trong khung 8h–16h, cùng host, cùng phòng, cùng sản phẩm. TV 43 inch giúp host đọc bình luận, đơn hàng của cả 2 nền tảng cùng lúc.</w:t>
+        <w:t>gắn thêm 01 iPhone 14 Pro (máy cũ) để live Shopee song song với TikTok trong khung 8h–16h, cùng host, cùng phòng, cùng sản phẩm.</w:t>
       </w:r>
     </w:p>
     <w:p>
@@ -2523,7 +2167,7 @@
         <w:rPr>
           <w:i w:val="0"/>
         </w:rPr>
-        <w:t>- Giả định biên lợi nhuận đóng góp 40% (sau giá vốn 30%, ads, phí sàn). Để hoàn vốn 18.089.400 đ trong 3 tháng, Shopee khung sáng – chiều cần đạt 15.074.500 đ/tháng ≈ 34% doanh thu Shopee khung tối tháng 9.</w:t>
+        <w:t>- Giả định biên lợi nhuận đóng góp 40% (sau giá vốn 30%, ads, phí sàn). Để hoàn vốn 11.815.400 đ trong 3 tháng, Shopee khung sáng – chiều cần đạt 9.846.167 đ/tháng ≈ 22% doanh thu Shopee khung tối tháng 9.</w:t>
       </w:r>
     </w:p>
     <w:tbl>
@@ -2689,7 +2333,7 @@
               <w:rPr>
                 <w:sz w:val="22"/>
               </w:rPr>
-              <w:t>3,4 tháng</w:t>
+              <w:t>2,2 tháng</w:t>
             </w:r>
           </w:p>
         </w:tc>
@@ -2762,7 +2406,7 @@
               <w:rPr>
                 <w:sz w:val="22"/>
               </w:rPr>
-              <w:t>2,1 tháng</w:t>
+              <w:t>1,3 tháng</w:t>
             </w:r>
           </w:p>
         </w:tc>
@@ -2835,7 +2479,7 @@
               <w:rPr>
                 <w:sz w:val="22"/>
               </w:rPr>
-              <w:t>1,0 tháng</w:t>
+              <w:t>0,7 tháng</w:t>
             </w:r>
           </w:p>
         </w:tc>
@@ -2861,7 +2505,7 @@
         <w:rPr>
           <w:i w:val="0"/>
         </w:rPr>
-        <w:t>Kính đề nghị Ban Giám đốc xem xét, phê duyệt ngân sách 18.089.400 đ để gắn thêm máy live Shopee khung sáng – chiều. Sau 1 tháng vận hành, bộ phận sẽ báo cáo kết quả làm căn cứ mở rộng thêm.</w:t>
+        <w:t>Kính đề nghị Ban Giám đốc xem xét, phê duyệt ngân sách 11.815.400 đ để gắn thêm máy live Shopee khung sáng – chiều. Sau 1 tháng vận hành, bộ phận sẽ báo cáo kết quả làm căn cứ mở rộng thêm.</w:t>
       </w:r>
     </w:p>
     <w:p>

</xml_diff>